<commit_message>
TP1 Orga de datos
</commit_message>
<xml_diff>
--- a/Organizacion_de_Datos/TP1.docx
+++ b/Organizacion_de_Datos/TP1.docx
@@ -1612,19 +1612,7 @@
               <w:rPr>
                 <w:rFonts w:ascii="Arial Narrow" w:hAnsi="Arial Narrow"/>
               </w:rPr>
-              <w:t xml:space="preserve">+ </w:t>
-            </w:r>
-            <w:r>
-              <w:rPr>
-                <w:rFonts w:ascii="Arial Narrow" w:hAnsi="Arial Narrow"/>
-              </w:rPr>
-              <w:t>C</w:t>
-            </w:r>
-            <w:r>
-              <w:rPr>
-                <w:rFonts w:ascii="Arial Narrow" w:hAnsi="Arial Narrow"/>
-              </w:rPr>
-              <w:t>V</w:t>
+              <w:t>+ CV</w:t>
             </w:r>
           </w:p>
           <w:p>
@@ -1786,13 +1774,7 @@
               <w:rPr>
                 <w:rFonts w:ascii="Arial Narrow" w:hAnsi="Arial Narrow"/>
               </w:rPr>
-              <w:t xml:space="preserve"> C</w:t>
-            </w:r>
-            <w:r>
-              <w:rPr>
-                <w:rFonts w:ascii="Arial Narrow" w:hAnsi="Arial Narrow"/>
-              </w:rPr>
-              <w:t>V</w:t>
+              <w:t xml:space="preserve"> CV</w:t>
             </w:r>
             <w:r>
               <w:rPr>
@@ -1818,13 +1800,7 @@
               <w:rPr>
                 <w:rFonts w:ascii="Arial Narrow" w:hAnsi="Arial Narrow"/>
               </w:rPr>
-              <w:t xml:space="preserve"> C</w:t>
-            </w:r>
-            <w:r>
-              <w:rPr>
-                <w:rFonts w:ascii="Arial Narrow" w:hAnsi="Arial Narrow"/>
-              </w:rPr>
-              <w:t>V</w:t>
+              <w:t xml:space="preserve"> CV</w:t>
             </w:r>
           </w:p>
           <w:p>
@@ -1948,13 +1924,7 @@
               <w:rPr>
                 <w:rFonts w:ascii="Arial Narrow" w:hAnsi="Arial Narrow"/>
               </w:rPr>
-              <w:t xml:space="preserve"> C</w:t>
-            </w:r>
-            <w:r>
-              <w:rPr>
-                <w:rFonts w:ascii="Arial Narrow" w:hAnsi="Arial Narrow"/>
-              </w:rPr>
-              <w:t>V</w:t>
+              <w:t xml:space="preserve"> CV</w:t>
             </w:r>
           </w:p>
           <w:p>
@@ -1974,13 +1944,7 @@
               <w:rPr>
                 <w:rFonts w:ascii="Arial Narrow" w:hAnsi="Arial Narrow"/>
               </w:rPr>
-              <w:t xml:space="preserve"> C</w:t>
-            </w:r>
-            <w:r>
-              <w:rPr>
-                <w:rFonts w:ascii="Arial Narrow" w:hAnsi="Arial Narrow"/>
-              </w:rPr>
-              <w:t>V</w:t>
+              <w:t xml:space="preserve"> CV</w:t>
             </w:r>
           </w:p>
           <w:p>
@@ -2000,13 +1964,7 @@
               <w:rPr>
                 <w:rFonts w:ascii="Arial Narrow" w:hAnsi="Arial Narrow"/>
               </w:rPr>
-              <w:t xml:space="preserve"> C</w:t>
-            </w:r>
-            <w:r>
-              <w:rPr>
-                <w:rFonts w:ascii="Arial Narrow" w:hAnsi="Arial Narrow"/>
-              </w:rPr>
-              <w:t>V</w:t>
+              <w:t xml:space="preserve"> CV</w:t>
             </w:r>
           </w:p>
           <w:p>
@@ -2077,7 +2035,7 @@
           <w:color w:val="000000"/>
           <w:lang w:eastAsia="es-AR"/>
         </w:rPr>
-        <w:t xml:space="preserve">En la estructura de tamaño </w:t>
+        <w:t>En la estructura de tamaño fijo, aunque se desaproveche espacio</w:t>
       </w:r>
       <w:r>
         <w:rPr>
@@ -2085,7 +2043,7 @@
           <w:color w:val="000000"/>
           <w:lang w:eastAsia="es-AR"/>
         </w:rPr>
-        <w:t>fijo,</w:t>
+        <w:t>,</w:t>
       </w:r>
       <w:r>
         <w:rPr>
@@ -2093,71 +2051,7 @@
           <w:color w:val="000000"/>
           <w:lang w:eastAsia="es-AR"/>
         </w:rPr>
-        <w:t xml:space="preserve"> aunque se desaproveche espacio dado que se reserva de </w:t>
-      </w:r>
-      <w:r>
-        <w:rPr>
-          <w:rFonts w:ascii="Arial Narrow" w:eastAsia="Times New Roman" w:hAnsi="Arial Narrow" w:cs="Arial"/>
-          <w:color w:val="000000"/>
-          <w:lang w:eastAsia="es-AR"/>
-        </w:rPr>
-        <w:t>más</w:t>
-      </w:r>
-      <w:r>
-        <w:rPr>
-          <w:rFonts w:ascii="Arial Narrow" w:eastAsia="Times New Roman" w:hAnsi="Arial Narrow" w:cs="Arial"/>
-          <w:color w:val="000000"/>
-          <w:lang w:eastAsia="es-AR"/>
-        </w:rPr>
-        <w:t xml:space="preserve">, facilita la </w:t>
-      </w:r>
-      <w:r>
-        <w:rPr>
-          <w:rFonts w:ascii="Arial Narrow" w:eastAsia="Times New Roman" w:hAnsi="Arial Narrow" w:cs="Arial"/>
-          <w:color w:val="000000"/>
-          <w:lang w:eastAsia="es-AR"/>
-        </w:rPr>
-        <w:t>dirección</w:t>
-      </w:r>
-      <w:r>
-        <w:rPr>
-          <w:rFonts w:ascii="Arial Narrow" w:eastAsia="Times New Roman" w:hAnsi="Arial Narrow" w:cs="Arial"/>
-          <w:color w:val="000000"/>
-          <w:lang w:eastAsia="es-AR"/>
-        </w:rPr>
-        <w:t xml:space="preserve"> y </w:t>
-      </w:r>
-      <w:r>
-        <w:rPr>
-          <w:rFonts w:ascii="Arial Narrow" w:eastAsia="Times New Roman" w:hAnsi="Arial Narrow" w:cs="Arial"/>
-          <w:color w:val="000000"/>
-          <w:lang w:eastAsia="es-AR"/>
-        </w:rPr>
-        <w:t>extracción</w:t>
-      </w:r>
-      <w:r>
-        <w:rPr>
-          <w:rFonts w:ascii="Arial Narrow" w:eastAsia="Times New Roman" w:hAnsi="Arial Narrow" w:cs="Arial"/>
-          <w:color w:val="000000"/>
-          <w:lang w:eastAsia="es-AR"/>
-        </w:rPr>
-        <w:t xml:space="preserve"> de </w:t>
-      </w:r>
-      <w:r>
-        <w:rPr>
-          <w:rFonts w:ascii="Arial Narrow" w:eastAsia="Times New Roman" w:hAnsi="Arial Narrow" w:cs="Arial"/>
-          <w:color w:val="000000"/>
-          <w:lang w:eastAsia="es-AR"/>
-        </w:rPr>
-        <w:t>información</w:t>
-      </w:r>
-      <w:r>
-        <w:rPr>
-          <w:rFonts w:ascii="Arial Narrow" w:eastAsia="Times New Roman" w:hAnsi="Arial Narrow" w:cs="Arial"/>
-          <w:color w:val="000000"/>
-          <w:lang w:eastAsia="es-AR"/>
-        </w:rPr>
-        <w:t xml:space="preserve"> de los campos.</w:t>
+        <w:t xml:space="preserve"> dado que se reserva de más, facilita la dirección y extracción de información de los campos.</w:t>
       </w:r>
     </w:p>
     <w:p>
@@ -2178,23 +2072,7 @@
           <w:color w:val="000000"/>
           <w:lang w:eastAsia="es-AR"/>
         </w:rPr>
-        <w:t xml:space="preserve">En la estructura de tamaño variable no se desperdicia espacio, pero la lectura y escritura es </w:t>
-      </w:r>
-      <w:r>
-        <w:rPr>
-          <w:rFonts w:ascii="Arial Narrow" w:eastAsia="Times New Roman" w:hAnsi="Arial Narrow" w:cs="Arial"/>
-          <w:color w:val="000000"/>
-          <w:lang w:eastAsia="es-AR"/>
-        </w:rPr>
-        <w:t>más</w:t>
-      </w:r>
-      <w:r>
-        <w:rPr>
-          <w:rFonts w:ascii="Arial Narrow" w:eastAsia="Times New Roman" w:hAnsi="Arial Narrow" w:cs="Arial"/>
-          <w:color w:val="000000"/>
-          <w:lang w:eastAsia="es-AR"/>
-        </w:rPr>
-        <w:t xml:space="preserve"> compleja debido a desconocer el tamaño total de cada registro.</w:t>
+        <w:t>En la estructura de tamaño variable no se desperdicia espacio, pero la lectura y escritura es más compleja debido a desconocer el tamaño total de cada registro.</w:t>
       </w:r>
     </w:p>
     <w:p>
@@ -2346,9 +2224,9 @@
           <w:i/>
           <w:iCs/>
         </w:rPr>
-        <w:t xml:space="preserve">)?, (consulta(((diagnostico)d)?, </w:t>
-      </w:r>
-      <w:proofErr w:type="spellStart"/>
+        <w:t>)?, (consulta(((diagnostico)</w:t>
+      </w:r>
+      <w:proofErr w:type="gramStart"/>
       <w:r>
         <w:rPr>
           <w:rFonts w:ascii="Arial Narrow" w:hAnsi="Arial Narrow"/>
@@ -2357,9 +2235,9 @@
           <w:i/>
           <w:iCs/>
         </w:rPr>
-        <w:t>descripcion</w:t>
-      </w:r>
-      <w:proofErr w:type="spellEnd"/>
+        <w:t>d)?,</w:t>
+      </w:r>
+      <w:proofErr w:type="gramEnd"/>
       <w:r>
         <w:rPr>
           <w:rFonts w:ascii="Arial Narrow" w:hAnsi="Arial Narrow"/>
@@ -2368,7 +2246,7 @@
           <w:i/>
           <w:iCs/>
         </w:rPr>
-        <w:t>, (practica)*,(</w:t>
+        <w:t xml:space="preserve"> </w:t>
       </w:r>
       <w:proofErr w:type="spellStart"/>
       <w:r>
@@ -2379,7 +2257,7 @@
           <w:i/>
           <w:iCs/>
         </w:rPr>
-        <w:t>prescripcion</w:t>
+        <w:t>descripcion</w:t>
       </w:r>
       <w:proofErr w:type="spellEnd"/>
       <w:r>
@@ -2390,7 +2268,63 @@
           <w:i/>
           <w:iCs/>
         </w:rPr>
-        <w:t>)*))*)</w:t>
+        <w:t>, (practica)</w:t>
+      </w:r>
+      <w:proofErr w:type="gramStart"/>
+      <w:r>
+        <w:rPr>
+          <w:rFonts w:ascii="Arial Narrow" w:hAnsi="Arial Narrow"/>
+          <w:b/>
+          <w:bCs/>
+          <w:i/>
+          <w:iCs/>
+        </w:rPr>
+        <w:t>*,(</w:t>
+      </w:r>
+      <w:proofErr w:type="spellStart"/>
+      <w:proofErr w:type="gramEnd"/>
+      <w:r>
+        <w:rPr>
+          <w:rFonts w:ascii="Arial Narrow" w:hAnsi="Arial Narrow"/>
+          <w:b/>
+          <w:bCs/>
+          <w:i/>
+          <w:iCs/>
+        </w:rPr>
+        <w:t>prescripcion</w:t>
+      </w:r>
+      <w:proofErr w:type="spellEnd"/>
+      <w:r>
+        <w:rPr>
+          <w:rFonts w:ascii="Arial Narrow" w:hAnsi="Arial Narrow"/>
+          <w:b/>
+          <w:bCs/>
+          <w:i/>
+          <w:iCs/>
+        </w:rPr>
+        <w:t>)*</w:t>
+      </w:r>
+      <w:proofErr w:type="gramStart"/>
+      <w:r>
+        <w:rPr>
+          <w:rFonts w:ascii="Arial Narrow" w:hAnsi="Arial Narrow"/>
+          <w:b/>
+          <w:bCs/>
+          <w:i/>
+          <w:iCs/>
+        </w:rPr>
+        <w:t>))*</w:t>
+      </w:r>
+      <w:proofErr w:type="gramEnd"/>
+      <w:r>
+        <w:rPr>
+          <w:rFonts w:ascii="Arial Narrow" w:hAnsi="Arial Narrow"/>
+          <w:b/>
+          <w:bCs/>
+          <w:i/>
+          <w:iCs/>
+        </w:rPr>
+        <w:t>)</w:t>
       </w:r>
     </w:p>
     <w:p>
@@ -2431,12 +2365,20 @@
         <w:rPr>
           <w:rFonts w:ascii="Arial Narrow" w:hAnsi="Arial Narrow"/>
         </w:rPr>
-        <w:t xml:space="preserve">El registro es de </w:t>
+        <w:t>El registro</w:t>
+      </w:r>
+      <w:r>
+        <w:rPr>
+          <w:rFonts w:ascii="Arial Narrow" w:hAnsi="Arial Narrow"/>
+        </w:rPr>
+        <w:t xml:space="preserve"> es llamado </w:t>
       </w:r>
       <w:proofErr w:type="spellStart"/>
       <w:r>
         <w:rPr>
           <w:rFonts w:ascii="Arial Narrow" w:hAnsi="Arial Narrow"/>
+          <w:i/>
+          <w:iCs/>
         </w:rPr>
         <w:t>ConsultasMedicas</w:t>
       </w:r>
@@ -2445,29 +2387,55 @@
         <w:rPr>
           <w:rFonts w:ascii="Arial Narrow" w:hAnsi="Arial Narrow"/>
         </w:rPr>
-        <w:t xml:space="preserve">, cada uno tiene 4 atributos. El primero resulta ser el identificador de la consulta, que </w:t>
-      </w:r>
-      <w:proofErr w:type="spellStart"/>
-      <w:proofErr w:type="gramStart"/>
-      <w:r>
-        <w:rPr>
-          <w:rFonts w:ascii="Arial Narrow" w:hAnsi="Arial Narrow"/>
-        </w:rPr>
-        <w:t>esta</w:t>
-      </w:r>
-      <w:proofErr w:type="spellEnd"/>
-      <w:r>
-        <w:rPr>
-          <w:rFonts w:ascii="Arial Narrow" w:hAnsi="Arial Narrow"/>
-        </w:rPr>
-        <w:t xml:space="preserve"> compuesto</w:t>
-      </w:r>
-      <w:proofErr w:type="gramEnd"/>
-      <w:r>
-        <w:rPr>
-          <w:rFonts w:ascii="Arial Narrow" w:hAnsi="Arial Narrow"/>
-        </w:rPr>
-        <w:t xml:space="preserve"> por una fecha, hora y el medico que realiza la misma, el cual </w:t>
+        <w:t xml:space="preserve"> </w:t>
+      </w:r>
+      <w:r>
+        <w:rPr>
+          <w:rFonts w:ascii="Arial Narrow" w:hAnsi="Arial Narrow"/>
+        </w:rPr>
+        <w:t xml:space="preserve">y posee </w:t>
+      </w:r>
+      <w:r>
+        <w:rPr>
+          <w:rFonts w:ascii="Arial Narrow" w:hAnsi="Arial Narrow"/>
+        </w:rPr>
+        <w:t xml:space="preserve">4 atributos. El primero </w:t>
+      </w:r>
+      <w:r>
+        <w:rPr>
+          <w:rFonts w:ascii="Arial Narrow" w:hAnsi="Arial Narrow"/>
+        </w:rPr>
+        <w:t xml:space="preserve">es </w:t>
+      </w:r>
+      <w:r>
+        <w:rPr>
+          <w:rFonts w:ascii="Arial Narrow" w:hAnsi="Arial Narrow"/>
+        </w:rPr>
+        <w:t>el identificador de</w:t>
+      </w:r>
+      <w:r>
+        <w:rPr>
+          <w:rFonts w:ascii="Arial Narrow" w:hAnsi="Arial Narrow"/>
+        </w:rPr>
+        <w:t>l</w:t>
+      </w:r>
+      <w:r>
+        <w:rPr>
+          <w:rFonts w:ascii="Arial Narrow" w:hAnsi="Arial Narrow"/>
+        </w:rPr>
+        <w:t xml:space="preserve"> </w:t>
+      </w:r>
+      <w:r>
+        <w:rPr>
+          <w:rFonts w:ascii="Arial Narrow" w:hAnsi="Arial Narrow"/>
+        </w:rPr>
+        <w:t>registro</w:t>
+      </w:r>
+      <w:r>
+        <w:rPr>
+          <w:rFonts w:ascii="Arial Narrow" w:hAnsi="Arial Narrow"/>
+        </w:rPr>
+        <w:t xml:space="preserve">, que </w:t>
       </w:r>
       <w:r>
         <w:rPr>
@@ -2479,43 +2447,7 @@
         <w:rPr>
           <w:rFonts w:ascii="Arial Narrow" w:hAnsi="Arial Narrow"/>
         </w:rPr>
-        <w:t xml:space="preserve"> definido por </w:t>
-      </w:r>
-      <w:r>
-        <w:rPr>
-          <w:rFonts w:ascii="Arial Narrow" w:hAnsi="Arial Narrow"/>
-        </w:rPr>
-        <w:t>extensión</w:t>
-      </w:r>
-      <w:r>
-        <w:rPr>
-          <w:rFonts w:ascii="Arial Narrow" w:hAnsi="Arial Narrow"/>
-        </w:rPr>
-        <w:t xml:space="preserve"> en otro archivo. El siguiente atributo es el paciente de </w:t>
-      </w:r>
-      <w:r>
-        <w:rPr>
-          <w:rFonts w:ascii="Arial Narrow" w:hAnsi="Arial Narrow"/>
-        </w:rPr>
-        <w:t>esta</w:t>
-      </w:r>
-      <w:r>
-        <w:rPr>
-          <w:rFonts w:ascii="Arial Narrow" w:hAnsi="Arial Narrow"/>
-        </w:rPr>
-        <w:t xml:space="preserve">, que a </w:t>
-      </w:r>
-      <w:r>
-        <w:rPr>
-          <w:rFonts w:ascii="Arial Narrow" w:hAnsi="Arial Narrow"/>
-        </w:rPr>
-        <w:t>también</w:t>
-      </w:r>
-      <w:r>
-        <w:rPr>
-          <w:rFonts w:ascii="Arial Narrow" w:hAnsi="Arial Narrow"/>
-        </w:rPr>
-        <w:t xml:space="preserve"> </w:t>
+        <w:t xml:space="preserve"> compuesto por una fecha, hora y el medico que realiza la misma, el cual está definido por extensión en otro archivo. El siguiente atributo es el paciente de esta, que a también </w:t>
       </w:r>
       <w:r>
         <w:rPr>
@@ -2527,43 +2459,7 @@
         <w:rPr>
           <w:rFonts w:ascii="Arial Narrow" w:hAnsi="Arial Narrow"/>
         </w:rPr>
-        <w:t xml:space="preserve"> definido por </w:t>
-      </w:r>
-      <w:r>
-        <w:rPr>
-          <w:rFonts w:ascii="Arial Narrow" w:hAnsi="Arial Narrow"/>
-        </w:rPr>
-        <w:t>extensión</w:t>
-      </w:r>
-      <w:r>
-        <w:rPr>
-          <w:rFonts w:ascii="Arial Narrow" w:hAnsi="Arial Narrow"/>
-        </w:rPr>
-        <w:t xml:space="preserve"> en otro archivo. Luego sigue un atributo opcional, que es la obra social, </w:t>
-      </w:r>
-      <w:r>
-        <w:rPr>
-          <w:rFonts w:ascii="Arial Narrow" w:hAnsi="Arial Narrow"/>
-        </w:rPr>
-        <w:t>también</w:t>
-      </w:r>
-      <w:r>
-        <w:rPr>
-          <w:rFonts w:ascii="Arial Narrow" w:hAnsi="Arial Narrow"/>
-        </w:rPr>
-        <w:t xml:space="preserve"> definida por </w:t>
-      </w:r>
-      <w:r>
-        <w:rPr>
-          <w:rFonts w:ascii="Arial Narrow" w:hAnsi="Arial Narrow"/>
-        </w:rPr>
-        <w:t>extensión</w:t>
-      </w:r>
-      <w:r>
-        <w:rPr>
-          <w:rFonts w:ascii="Arial Narrow" w:hAnsi="Arial Narrow"/>
-        </w:rPr>
-        <w:t xml:space="preserve"> en otro archivo.</w:t>
+        <w:t xml:space="preserve"> definido por extensión en otro archivo. Luego sigue un atributo opcional, que es la obra social, también definida por extensión en otro archivo.</w:t>
       </w:r>
     </w:p>
     <w:p>
@@ -2579,127 +2475,7 @@
           <w:rFonts w:ascii="Arial Narrow" w:hAnsi="Arial Narrow"/>
         </w:rPr>
         <w:lastRenderedPageBreak/>
-        <w:t xml:space="preserve">Por </w:t>
-      </w:r>
-      <w:r>
-        <w:rPr>
-          <w:rFonts w:ascii="Arial Narrow" w:hAnsi="Arial Narrow"/>
-        </w:rPr>
-        <w:t>último</w:t>
-      </w:r>
-      <w:r>
-        <w:rPr>
-          <w:rFonts w:ascii="Arial Narrow" w:hAnsi="Arial Narrow"/>
-        </w:rPr>
-        <w:t xml:space="preserve">, el atributo consulta, que puede haber 0 o </w:t>
-      </w:r>
-      <w:r>
-        <w:rPr>
-          <w:rFonts w:ascii="Arial Narrow" w:hAnsi="Arial Narrow"/>
-        </w:rPr>
-        <w:t>más</w:t>
-      </w:r>
-      <w:r>
-        <w:rPr>
-          <w:rFonts w:ascii="Arial Narrow" w:hAnsi="Arial Narrow"/>
-        </w:rPr>
-        <w:t xml:space="preserve">, y </w:t>
-      </w:r>
-      <w:r>
-        <w:rPr>
-          <w:rFonts w:ascii="Arial Narrow" w:hAnsi="Arial Narrow"/>
-        </w:rPr>
-        <w:t>está</w:t>
-      </w:r>
-      <w:r>
-        <w:rPr>
-          <w:rFonts w:ascii="Arial Narrow" w:hAnsi="Arial Narrow"/>
-        </w:rPr>
-        <w:t xml:space="preserve"> compuesta por otros 4 atributos internos. Los cuales son; diagnostico que </w:t>
-      </w:r>
-      <w:r>
-        <w:rPr>
-          <w:rFonts w:ascii="Arial Narrow" w:hAnsi="Arial Narrow"/>
-        </w:rPr>
-        <w:t>está</w:t>
-      </w:r>
-      <w:r>
-        <w:rPr>
-          <w:rFonts w:ascii="Arial Narrow" w:hAnsi="Arial Narrow"/>
-        </w:rPr>
-        <w:t xml:space="preserve"> definido por </w:t>
-      </w:r>
-      <w:r>
-        <w:rPr>
-          <w:rFonts w:ascii="Arial Narrow" w:hAnsi="Arial Narrow"/>
-        </w:rPr>
-        <w:t>extensión</w:t>
-      </w:r>
-      <w:r>
-        <w:rPr>
-          <w:rFonts w:ascii="Arial Narrow" w:hAnsi="Arial Narrow"/>
-        </w:rPr>
-        <w:t xml:space="preserve"> en otro archivo y puede ser opcional; la </w:t>
-      </w:r>
-      <w:r>
-        <w:rPr>
-          <w:rFonts w:ascii="Arial Narrow" w:hAnsi="Arial Narrow"/>
-        </w:rPr>
-        <w:t>descripción</w:t>
-      </w:r>
-      <w:r>
-        <w:rPr>
-          <w:rFonts w:ascii="Arial Narrow" w:hAnsi="Arial Narrow"/>
-        </w:rPr>
-        <w:t xml:space="preserve"> de la </w:t>
-      </w:r>
-      <w:r>
-        <w:rPr>
-          <w:rFonts w:ascii="Arial Narrow" w:hAnsi="Arial Narrow"/>
-        </w:rPr>
-        <w:t>atención</w:t>
-      </w:r>
-      <w:r>
-        <w:rPr>
-          <w:rFonts w:ascii="Arial Narrow" w:hAnsi="Arial Narrow"/>
-        </w:rPr>
-        <w:t xml:space="preserve">; la </w:t>
-      </w:r>
-      <w:r>
-        <w:rPr>
-          <w:rFonts w:ascii="Arial Narrow" w:hAnsi="Arial Narrow"/>
-        </w:rPr>
-        <w:t>práctica</w:t>
-      </w:r>
-      <w:r>
-        <w:rPr>
-          <w:rFonts w:ascii="Arial Narrow" w:hAnsi="Arial Narrow"/>
-        </w:rPr>
-        <w:t xml:space="preserve"> y la </w:t>
-      </w:r>
-      <w:r>
-        <w:rPr>
-          <w:rFonts w:ascii="Arial Narrow" w:hAnsi="Arial Narrow"/>
-        </w:rPr>
-        <w:t>prescripción</w:t>
-      </w:r>
-      <w:r>
-        <w:rPr>
-          <w:rFonts w:ascii="Arial Narrow" w:hAnsi="Arial Narrow"/>
-        </w:rPr>
-        <w:t xml:space="preserve"> realizada, que pueden haber 0 o </w:t>
-      </w:r>
-      <w:r>
-        <w:rPr>
-          <w:rFonts w:ascii="Arial Narrow" w:hAnsi="Arial Narrow"/>
-        </w:rPr>
-        <w:t>más</w:t>
-      </w:r>
-      <w:r>
-        <w:rPr>
-          <w:rFonts w:ascii="Arial Narrow" w:hAnsi="Arial Narrow"/>
-        </w:rPr>
-        <w:t xml:space="preserve"> de cada.</w:t>
+        <w:t>Por último, el atributo consulta, que puede haber 0 o más, y está compuesta por otros 4 atributos internos. Los cuales son; diagnostico que está definido por extensión en otro archivo y puede ser opcional; la descripción de la atención; la práctica y la prescripción realizada, que pueden haber 0 o más de.</w:t>
       </w:r>
     </w:p>
     <w:p>
@@ -2756,6 +2532,16 @@
         </w:rPr>
         <w:t>Es un archivo tipificado con registros de longitud variable.</w:t>
       </w:r>
+    </w:p>
+    <w:p>
+      <w:pPr>
+        <w:spacing w:line="276" w:lineRule="auto"/>
+        <w:ind w:left="720"/>
+        <w:jc w:val="both"/>
+        <w:rPr>
+          <w:rFonts w:ascii="Arial Narrow" w:hAnsi="Arial Narrow"/>
+        </w:rPr>
+      </w:pPr>
     </w:p>
     <w:p>
       <w:pPr>
@@ -3166,16 +2952,50 @@
     <w:p>
       <w:pPr>
         <w:spacing w:line="276" w:lineRule="auto"/>
-        <w:ind w:left="360"/>
+        <w:ind w:left="709"/>
         <w:jc w:val="both"/>
         <w:rPr>
           <w:rFonts w:ascii="Arial Narrow" w:hAnsi="Arial Narrow"/>
-          <w:b/>
-          <w:bCs/>
-          <w:i/>
-          <w:iCs/>
-        </w:rPr>
-      </w:pPr>
+        </w:rPr>
+      </w:pPr>
+      <w:r>
+        <w:rPr>
+          <w:rFonts w:ascii="Arial Narrow" w:hAnsi="Arial Narrow"/>
+        </w:rPr>
+        <w:t>En los años 50-60 distintas computadoras usaban distinto tamaños de bytes. Sin embargo, cuando se diseñó la familia de computador</w:t>
+      </w:r>
+      <w:r>
+        <w:rPr>
+          <w:rFonts w:ascii="Arial Narrow" w:hAnsi="Arial Narrow"/>
+        </w:rPr>
+        <w:t>a</w:t>
+      </w:r>
+      <w:r>
+        <w:rPr>
+          <w:rFonts w:ascii="Arial Narrow" w:hAnsi="Arial Narrow"/>
+        </w:rPr>
+        <w:t xml:space="preserve">s IBM </w:t>
+      </w:r>
+      <w:proofErr w:type="spellStart"/>
+      <w:r>
+        <w:rPr>
+          <w:rFonts w:ascii="Arial Narrow" w:hAnsi="Arial Narrow"/>
+        </w:rPr>
+        <w:t>System</w:t>
+      </w:r>
+      <w:proofErr w:type="spellEnd"/>
+      <w:r>
+        <w:rPr>
+          <w:rFonts w:ascii="Arial Narrow" w:hAnsi="Arial Narrow"/>
+        </w:rPr>
+        <w:t>/360 en 1964, IBM estandarizó el byte de 8 bits porque al permitir representar 256 valores distintos era suficiente para codificar caracteres</w:t>
+      </w:r>
+      <w:r>
+        <w:rPr>
+          <w:rFonts w:ascii="Arial Narrow" w:hAnsi="Arial Narrow"/>
+        </w:rPr>
+        <w:t>.</w:t>
+      </w:r>
     </w:p>
     <w:p>
       <w:pPr>
@@ -3489,6 +3309,7 @@
         <w:rPr>
           <w:rFonts w:ascii="Arial Narrow" w:eastAsiaTheme="minorEastAsia" w:hAnsi="Arial Narrow"/>
         </w:rPr>
+        <w:lastRenderedPageBreak/>
         <w:t>b: Cantidad de bytes por sector</w:t>
       </w:r>
     </w:p>
@@ -3537,7 +3358,6 @@
         <w:rPr>
           <w:rFonts w:ascii="Arial Narrow" w:eastAsiaTheme="minorEastAsia" w:hAnsi="Arial Narrow"/>
         </w:rPr>
-        <w:lastRenderedPageBreak/>
         <w:t>c: Cantidad de caras</w:t>
       </w:r>
     </w:p>
@@ -3652,19 +3472,7 @@
             <w:rPr>
               <w:rFonts w:ascii="Cambria Math" w:hAnsi="Cambria Math"/>
             </w:rPr>
-            <m:t xml:space="preserve">*16 caras= </m:t>
-          </m:r>
-          <m:r>
-            <w:rPr>
-              <w:rFonts w:ascii="Cambria Math" w:hAnsi="Cambria Math"/>
-            </w:rPr>
-            <m:t>1.073.741.824 bytes</m:t>
-          </m:r>
-          <m:r>
-            <w:rPr>
-              <w:rFonts w:ascii="Cambria Math" w:hAnsi="Cambria Math"/>
-            </w:rPr>
-            <m:t>=1,073741824 Gbytes</m:t>
+            <m:t>*16 caras= 1.073.741.824 bytes=1,073741824 Gbytes</m:t>
           </m:r>
         </m:oMath>
       </m:oMathPara>
@@ -3694,17 +3502,7 @@
           <w:i/>
           <w:iCs/>
         </w:rPr>
-        <w:t>C</w:t>
-      </w:r>
-      <w:r>
-        <w:rPr>
-          <w:rFonts w:ascii="Arial Narrow" w:hAnsi="Arial Narrow"/>
-          <w:b/>
-          <w:bCs/>
-          <w:i/>
-          <w:iCs/>
-        </w:rPr>
-        <w:t>alcular el tiempo medio de lectura de un disco de 7200 RPM, cuyo tiempo medio de posicionado anunciado por el fabricante es de 6,8 ms y el tiempo de transferencia de un sector es de 26,95 µs. La latencia de rotación para un disco de 7200 RPM es de 4,16 ms. Considerar que se lee solo un sector.</w:t>
+        <w:t>Calcular el tiempo medio de lectura de un disco de 7200 RPM, cuyo tiempo medio de posicionado anunciado por el fabricante es de 6,8 ms y el tiempo de transferencia de un sector es de 26,95 µs. La latencia de rotación para un disco de 7200 RPM es de 4,16 ms. Considerar que se lee solo un sector.</w:t>
       </w:r>
     </w:p>
     <w:p>
@@ -3950,13 +3748,7 @@
                     <w:rPr>
                       <w:rFonts w:ascii="Cambria Math" w:hAnsi="Cambria Math"/>
                     </w:rPr>
-                    <m:t xml:space="preserve"> </m:t>
-                  </m:r>
-                  <m:r>
-                    <w:rPr>
-                      <w:rFonts w:ascii="Cambria Math" w:hAnsi="Cambria Math"/>
-                    </w:rPr>
-                    <m:t>μs</m:t>
+                    <m:t xml:space="preserve"> μs</m:t>
                   </m:r>
                 </m:num>
                 <m:den>
@@ -4000,14 +3792,425 @@
       </m:oMathPara>
     </w:p>
     <w:sectPr>
+      <w:headerReference w:type="default" r:id="rId7"/>
+      <w:footerReference w:type="default" r:id="rId8"/>
+      <w:headerReference w:type="first" r:id="rId9"/>
       <w:pgSz w:w="11907" w:h="16840" w:code="9"/>
       <w:pgMar w:top="1417" w:right="1701" w:bottom="1417" w:left="1701" w:header="709" w:footer="709" w:gutter="0"/>
       <w:cols w:space="708"/>
-      <w:titlePg/>
       <w:docGrid w:linePitch="360"/>
     </w:sectPr>
   </w:body>
 </w:document>
+</file>
+
+<file path=word/endnotes.xml><?xml version="1.0" encoding="utf-8"?>
+<w:endnotes xmlns:wpc="http://schemas.microsoft.com/office/word/2010/wordprocessingCanvas" xmlns:cx="http://schemas.microsoft.com/office/drawing/2014/chartex" xmlns:cx1="http://schemas.microsoft.com/office/drawing/2015/9/8/chartex" xmlns:cx2="http://schemas.microsoft.com/office/drawing/2015/10/21/chartex" xmlns:cx3="http://schemas.microsoft.com/office/drawing/2016/5/9/chartex" xmlns:cx4="http://schemas.microsoft.com/office/drawing/2016/5/10/chartex" xmlns:cx5="http://schemas.microsoft.com/office/drawing/2016/5/11/chartex" xmlns:cx6="http://schemas.microsoft.com/office/drawing/2016/5/12/chartex" xmlns:cx7="http://schemas.microsoft.com/office/drawing/2016/5/13/chartex" xmlns:cx8="http://schemas.microsoft.com/office/drawing/2016/5/14/chartex" xmlns:mc="http://schemas.openxmlformats.org/markup-compatibility/2006" xmlns:aink="http://schemas.microsoft.com/office/drawing/2016/ink" xmlns:am3d="http://schemas.microsoft.com/office/drawing/2017/model3d" xmlns:o="urn:schemas-microsoft-com:office:office" xmlns:oel="http://schemas.microsoft.com/office/2019/extlst" xmlns:r="http://schemas.openxmlformats.org/officeDocument/2006/relationships" xmlns:m="http://schemas.openxmlformats.org/officeDocument/2006/math" xmlns:v="urn:schemas-microsoft-com:vml" xmlns:wp14="http://schemas.microsoft.com/office/word/2010/wordprocessingDrawing" xmlns:wp="http://schemas.openxmlformats.org/drawingml/2006/wordprocessingDrawing" xmlns:w10="urn:schemas-microsoft-com:office:word" xmlns:w="http://schemas.openxmlformats.org/wordprocessingml/2006/main" xmlns:w14="http://schemas.microsoft.com/office/word/2010/wordml" xmlns:w15="http://schemas.microsoft.com/office/word/2012/wordml" xmlns:w16cex="http://schemas.microsoft.com/office/word/2018/wordml/cex" xmlns:w16cid="http://schemas.microsoft.com/office/word/2016/wordml/cid" xmlns:w16="http://schemas.microsoft.com/office/word/2018/wordml" xmlns:w16du="http://schemas.microsoft.com/office/word/2023/wordml/word16du" xmlns:w16sdtdh="http://schemas.microsoft.com/office/word/2020/wordml/sdtdatahash" xmlns:w16sdtfl="http://schemas.microsoft.com/office/word/2024/wordml/sdtformatlock" xmlns:w16se="http://schemas.microsoft.com/office/word/2015/wordml/symex" xmlns:wpg="http://schemas.microsoft.com/office/word/2010/wordprocessingGroup" xmlns:wpi="http://schemas.microsoft.com/office/word/2010/wordprocessingInk" xmlns:wne="http://schemas.microsoft.com/office/word/2006/wordml" xmlns:wps="http://schemas.microsoft.com/office/word/2010/wordprocessingShape" mc:Ignorable="w14 w15 w16se w16cid w16 w16cex w16sdtdh w16sdtfl w16du wp14">
+  <w:endnote w:type="separator" w:id="-1">
+    <w:p>
+      <w:pPr>
+        <w:spacing w:after="0" w:line="240" w:lineRule="auto"/>
+      </w:pPr>
+      <w:r>
+        <w:separator/>
+      </w:r>
+    </w:p>
+  </w:endnote>
+  <w:endnote w:type="continuationSeparator" w:id="0">
+    <w:p>
+      <w:pPr>
+        <w:spacing w:after="0" w:line="240" w:lineRule="auto"/>
+      </w:pPr>
+      <w:r>
+        <w:continuationSeparator/>
+      </w:r>
+    </w:p>
+  </w:endnote>
+</w:endnotes>
+</file>
+
+<file path=word/footer1.xml><?xml version="1.0" encoding="utf-8"?>
+<w:ftr xmlns:wpc="http://schemas.microsoft.com/office/word/2010/wordprocessingCanvas" xmlns:cx="http://schemas.microsoft.com/office/drawing/2014/chartex" xmlns:cx1="http://schemas.microsoft.com/office/drawing/2015/9/8/chartex" xmlns:cx2="http://schemas.microsoft.com/office/drawing/2015/10/21/chartex" xmlns:cx3="http://schemas.microsoft.com/office/drawing/2016/5/9/chartex" xmlns:cx4="http://schemas.microsoft.com/office/drawing/2016/5/10/chartex" xmlns:cx5="http://schemas.microsoft.com/office/drawing/2016/5/11/chartex" xmlns:cx6="http://schemas.microsoft.com/office/drawing/2016/5/12/chartex" xmlns:cx7="http://schemas.microsoft.com/office/drawing/2016/5/13/chartex" xmlns:cx8="http://schemas.microsoft.com/office/drawing/2016/5/14/chartex" xmlns:mc="http://schemas.openxmlformats.org/markup-compatibility/2006" xmlns:aink="http://schemas.microsoft.com/office/drawing/2016/ink" xmlns:am3d="http://schemas.microsoft.com/office/drawing/2017/model3d" xmlns:o="urn:schemas-microsoft-com:office:office" xmlns:oel="http://schemas.microsoft.com/office/2019/extlst" xmlns:r="http://schemas.openxmlformats.org/officeDocument/2006/relationships" xmlns:m="http://schemas.openxmlformats.org/officeDocument/2006/math" xmlns:v="urn:schemas-microsoft-com:vml" xmlns:wp14="http://schemas.microsoft.com/office/word/2010/wordprocessingDrawing" xmlns:wp="http://schemas.openxmlformats.org/drawingml/2006/wordprocessingDrawing" xmlns:w10="urn:schemas-microsoft-com:office:word" xmlns:w="http://schemas.openxmlformats.org/wordprocessingml/2006/main" xmlns:w14="http://schemas.microsoft.com/office/word/2010/wordml" xmlns:w15="http://schemas.microsoft.com/office/word/2012/wordml" xmlns:w16cex="http://schemas.microsoft.com/office/word/2018/wordml/cex" xmlns:w16cid="http://schemas.microsoft.com/office/word/2016/wordml/cid" xmlns:w16="http://schemas.microsoft.com/office/word/2018/wordml" xmlns:w16du="http://schemas.microsoft.com/office/word/2023/wordml/word16du" xmlns:w16sdtdh="http://schemas.microsoft.com/office/word/2020/wordml/sdtdatahash" xmlns:w16sdtfl="http://schemas.microsoft.com/office/word/2024/wordml/sdtformatlock" xmlns:w16se="http://schemas.microsoft.com/office/word/2015/wordml/symex" xmlns:wpg="http://schemas.microsoft.com/office/word/2010/wordprocessingGroup" xmlns:wpi="http://schemas.microsoft.com/office/word/2010/wordprocessingInk" xmlns:wne="http://schemas.microsoft.com/office/word/2006/wordml" xmlns:wps="http://schemas.microsoft.com/office/word/2010/wordprocessingShape" mc:Ignorable="w14 w15 w16se w16cid w16 w16cex w16sdtdh w16sdtfl w16du wp14">
+  <w:sdt>
+    <w:sdtPr>
+      <w:id w:val="-113756590"/>
+      <w:docPartObj>
+        <w:docPartGallery w:val="Page Numbers (Bottom of Page)"/>
+        <w:docPartUnique/>
+      </w:docPartObj>
+    </w:sdtPr>
+    <w:sdtContent>
+      <w:p>
+        <w:pPr>
+          <w:pStyle w:val="Piedepgina"/>
+          <w:jc w:val="right"/>
+        </w:pPr>
+        <w:r>
+          <w:fldChar w:fldCharType="begin"/>
+        </w:r>
+        <w:r>
+          <w:instrText>PAGE   \* MERGEFORMAT</w:instrText>
+        </w:r>
+        <w:r>
+          <w:fldChar w:fldCharType="separate"/>
+        </w:r>
+        <w:r>
+          <w:rPr>
+            <w:lang w:val="es-ES"/>
+          </w:rPr>
+          <w:t>2</w:t>
+        </w:r>
+        <w:r>
+          <w:fldChar w:fldCharType="end"/>
+        </w:r>
+      </w:p>
+    </w:sdtContent>
+  </w:sdt>
+  <w:p>
+    <w:pPr>
+      <w:pStyle w:val="Piedepgina"/>
+    </w:pPr>
+  </w:p>
+</w:ftr>
+</file>
+
+<file path=word/footnotes.xml><?xml version="1.0" encoding="utf-8"?>
+<w:footnotes xmlns:wpc="http://schemas.microsoft.com/office/word/2010/wordprocessingCanvas" xmlns:cx="http://schemas.microsoft.com/office/drawing/2014/chartex" xmlns:cx1="http://schemas.microsoft.com/office/drawing/2015/9/8/chartex" xmlns:cx2="http://schemas.microsoft.com/office/drawing/2015/10/21/chartex" xmlns:cx3="http://schemas.microsoft.com/office/drawing/2016/5/9/chartex" xmlns:cx4="http://schemas.microsoft.com/office/drawing/2016/5/10/chartex" xmlns:cx5="http://schemas.microsoft.com/office/drawing/2016/5/11/chartex" xmlns:cx6="http://schemas.microsoft.com/office/drawing/2016/5/12/chartex" xmlns:cx7="http://schemas.microsoft.com/office/drawing/2016/5/13/chartex" xmlns:cx8="http://schemas.microsoft.com/office/drawing/2016/5/14/chartex" xmlns:mc="http://schemas.openxmlformats.org/markup-compatibility/2006" xmlns:aink="http://schemas.microsoft.com/office/drawing/2016/ink" xmlns:am3d="http://schemas.microsoft.com/office/drawing/2017/model3d" xmlns:o="urn:schemas-microsoft-com:office:office" xmlns:oel="http://schemas.microsoft.com/office/2019/extlst" xmlns:r="http://schemas.openxmlformats.org/officeDocument/2006/relationships" xmlns:m="http://schemas.openxmlformats.org/officeDocument/2006/math" xmlns:v="urn:schemas-microsoft-com:vml" xmlns:wp14="http://schemas.microsoft.com/office/word/2010/wordprocessingDrawing" xmlns:wp="http://schemas.openxmlformats.org/drawingml/2006/wordprocessingDrawing" xmlns:w10="urn:schemas-microsoft-com:office:word" xmlns:w="http://schemas.openxmlformats.org/wordprocessingml/2006/main" xmlns:w14="http://schemas.microsoft.com/office/word/2010/wordml" xmlns:w15="http://schemas.microsoft.com/office/word/2012/wordml" xmlns:w16cex="http://schemas.microsoft.com/office/word/2018/wordml/cex" xmlns:w16cid="http://schemas.microsoft.com/office/word/2016/wordml/cid" xmlns:w16="http://schemas.microsoft.com/office/word/2018/wordml" xmlns:w16du="http://schemas.microsoft.com/office/word/2023/wordml/word16du" xmlns:w16sdtdh="http://schemas.microsoft.com/office/word/2020/wordml/sdtdatahash" xmlns:w16sdtfl="http://schemas.microsoft.com/office/word/2024/wordml/sdtformatlock" xmlns:w16se="http://schemas.microsoft.com/office/word/2015/wordml/symex" xmlns:wpg="http://schemas.microsoft.com/office/word/2010/wordprocessingGroup" xmlns:wpi="http://schemas.microsoft.com/office/word/2010/wordprocessingInk" xmlns:wne="http://schemas.microsoft.com/office/word/2006/wordml" xmlns:wps="http://schemas.microsoft.com/office/word/2010/wordprocessingShape" mc:Ignorable="w14 w15 w16se w16cid w16 w16cex w16sdtdh w16sdtfl w16du wp14">
+  <w:footnote w:type="separator" w:id="-1">
+    <w:p>
+      <w:pPr>
+        <w:spacing w:after="0" w:line="240" w:lineRule="auto"/>
+      </w:pPr>
+      <w:r>
+        <w:separator/>
+      </w:r>
+    </w:p>
+  </w:footnote>
+  <w:footnote w:type="continuationSeparator" w:id="0">
+    <w:p>
+      <w:pPr>
+        <w:spacing w:after="0" w:line="240" w:lineRule="auto"/>
+      </w:pPr>
+      <w:r>
+        <w:continuationSeparator/>
+      </w:r>
+    </w:p>
+  </w:footnote>
+</w:footnotes>
+</file>
+
+<file path=word/header1.xml><?xml version="1.0" encoding="utf-8"?>
+<w:hdr xmlns:wpc="http://schemas.microsoft.com/office/word/2010/wordprocessingCanvas" xmlns:cx="http://schemas.microsoft.com/office/drawing/2014/chartex" xmlns:cx1="http://schemas.microsoft.com/office/drawing/2015/9/8/chartex" xmlns:cx2="http://schemas.microsoft.com/office/drawing/2015/10/21/chartex" xmlns:cx3="http://schemas.microsoft.com/office/drawing/2016/5/9/chartex" xmlns:cx4="http://schemas.microsoft.com/office/drawing/2016/5/10/chartex" xmlns:cx5="http://schemas.microsoft.com/office/drawing/2016/5/11/chartex" xmlns:cx6="http://schemas.microsoft.com/office/drawing/2016/5/12/chartex" xmlns:cx7="http://schemas.microsoft.com/office/drawing/2016/5/13/chartex" xmlns:cx8="http://schemas.microsoft.com/office/drawing/2016/5/14/chartex" xmlns:mc="http://schemas.openxmlformats.org/markup-compatibility/2006" xmlns:aink="http://schemas.microsoft.com/office/drawing/2016/ink" xmlns:am3d="http://schemas.microsoft.com/office/drawing/2017/model3d" xmlns:o="urn:schemas-microsoft-com:office:office" xmlns:oel="http://schemas.microsoft.com/office/2019/extlst" xmlns:r="http://schemas.openxmlformats.org/officeDocument/2006/relationships" xmlns:m="http://schemas.openxmlformats.org/officeDocument/2006/math" xmlns:v="urn:schemas-microsoft-com:vml" xmlns:wp14="http://schemas.microsoft.com/office/word/2010/wordprocessingDrawing" xmlns:wp="http://schemas.openxmlformats.org/drawingml/2006/wordprocessingDrawing" xmlns:w10="urn:schemas-microsoft-com:office:word" xmlns:w="http://schemas.openxmlformats.org/wordprocessingml/2006/main" xmlns:w14="http://schemas.microsoft.com/office/word/2010/wordml" xmlns:w15="http://schemas.microsoft.com/office/word/2012/wordml" xmlns:w16cex="http://schemas.microsoft.com/office/word/2018/wordml/cex" xmlns:w16cid="http://schemas.microsoft.com/office/word/2016/wordml/cid" xmlns:w16="http://schemas.microsoft.com/office/word/2018/wordml" xmlns:w16du="http://schemas.microsoft.com/office/word/2023/wordml/word16du" xmlns:w16sdtdh="http://schemas.microsoft.com/office/word/2020/wordml/sdtdatahash" xmlns:w16sdtfl="http://schemas.microsoft.com/office/word/2024/wordml/sdtformatlock" xmlns:w16se="http://schemas.microsoft.com/office/word/2015/wordml/symex" xmlns:wpg="http://schemas.microsoft.com/office/word/2010/wordprocessingGroup" xmlns:wpi="http://schemas.microsoft.com/office/word/2010/wordprocessingInk" xmlns:wne="http://schemas.microsoft.com/office/word/2006/wordml" xmlns:wps="http://schemas.microsoft.com/office/word/2010/wordprocessingShape" mc:Ignorable="w14 w15 w16se w16cid w16 w16cex w16sdtdh w16sdtfl w16du wp14">
+  <w:p>
+    <w:pPr>
+      <w:pStyle w:val="Encabezado"/>
+      <w:rPr>
+        <w:rFonts w:ascii="Cambria Math" w:hAnsi="Cambria Math" w:cs="Arial"/>
+        <w:color w:val="808080" w:themeColor="background1" w:themeShade="80"/>
+        <w:lang w:val="es-ES"/>
+      </w:rPr>
+    </w:pPr>
+    <w:r>
+      <w:rPr>
+        <w:rFonts w:ascii="Cambria Math" w:hAnsi="Cambria Math"/>
+        <w:noProof/>
+        <w:color w:val="808080" w:themeColor="background1" w:themeShade="80"/>
+        <w:lang w:val="en-US"/>
+      </w:rPr>
+      <w:drawing>
+        <wp:anchor distT="0" distB="0" distL="114300" distR="114300" simplePos="0" relativeHeight="251661312" behindDoc="0" locked="0" layoutInCell="1" allowOverlap="1" wp14:anchorId="20B0A546" wp14:editId="33C13157">
+          <wp:simplePos x="0" y="0"/>
+          <wp:positionH relativeFrom="column">
+            <wp:posOffset>4865066</wp:posOffset>
+          </wp:positionH>
+          <wp:positionV relativeFrom="paragraph">
+            <wp:posOffset>-52070</wp:posOffset>
+          </wp:positionV>
+          <wp:extent cx="819150" cy="564515"/>
+          <wp:effectExtent l="0" t="0" r="0" b="6985"/>
+          <wp:wrapSquare wrapText="bothSides"/>
+          <wp:docPr id="148612065" name="Imagen 18"/>
+          <wp:cNvGraphicFramePr>
+            <a:graphicFrameLocks xmlns:a="http://schemas.openxmlformats.org/drawingml/2006/main" noChangeAspect="1"/>
+          </wp:cNvGraphicFramePr>
+          <a:graphic xmlns:a="http://schemas.openxmlformats.org/drawingml/2006/main">
+            <a:graphicData uri="http://schemas.openxmlformats.org/drawingml/2006/picture">
+              <pic:pic xmlns:pic="http://schemas.openxmlformats.org/drawingml/2006/picture">
+                <pic:nvPicPr>
+                  <pic:cNvPr id="0" name="Imagen 58"/>
+                  <pic:cNvPicPr>
+                    <a:picLocks noChangeAspect="1" noChangeArrowheads="1"/>
+                  </pic:cNvPicPr>
+                </pic:nvPicPr>
+                <pic:blipFill>
+                  <a:blip r:embed="rId1">
+                    <a:extLst>
+                      <a:ext uri="{28A0092B-C50C-407E-A947-70E740481C1C}">
+                        <a14:useLocalDpi xmlns:a14="http://schemas.microsoft.com/office/drawing/2010/main" val="0"/>
+                      </a:ext>
+                    </a:extLst>
+                  </a:blip>
+                  <a:srcRect/>
+                  <a:stretch>
+                    <a:fillRect/>
+                  </a:stretch>
+                </pic:blipFill>
+                <pic:spPr bwMode="auto">
+                  <a:xfrm>
+                    <a:off x="0" y="0"/>
+                    <a:ext cx="819150" cy="564515"/>
+                  </a:xfrm>
+                  <a:prstGeom prst="rect">
+                    <a:avLst/>
+                  </a:prstGeom>
+                  <a:noFill/>
+                </pic:spPr>
+              </pic:pic>
+            </a:graphicData>
+          </a:graphic>
+          <wp14:sizeRelH relativeFrom="page">
+            <wp14:pctWidth>0</wp14:pctWidth>
+          </wp14:sizeRelH>
+          <wp14:sizeRelV relativeFrom="page">
+            <wp14:pctHeight>0</wp14:pctHeight>
+          </wp14:sizeRelV>
+        </wp:anchor>
+      </w:drawing>
+    </w:r>
+    <w:r>
+      <w:rPr>
+        <w:rFonts w:ascii="Cambria Math" w:hAnsi="Cambria Math" w:cs="Arial"/>
+        <w:color w:val="808080" w:themeColor="background1" w:themeShade="80"/>
+        <w:lang w:val="es-ES"/>
+      </w:rPr>
+      <w:t>Universidad Nacional de Mar del Plata – Facultad de Ingeniería</w:t>
+    </w:r>
+  </w:p>
+  <w:p>
+    <w:pPr>
+      <w:pStyle w:val="Encabezado"/>
+      <w:tabs>
+        <w:tab w:val="left" w:pos="6210"/>
+      </w:tabs>
+      <w:rPr>
+        <w:rFonts w:ascii="Cambria Math" w:hAnsi="Cambria Math" w:cs="Arial"/>
+        <w:color w:val="808080" w:themeColor="background1" w:themeShade="80"/>
+        <w:lang w:val="es-ES"/>
+      </w:rPr>
+    </w:pPr>
+    <w:r>
+      <w:rPr>
+        <w:rFonts w:ascii="Cambria Math" w:hAnsi="Cambria Math" w:cs="Arial"/>
+        <w:color w:val="808080" w:themeColor="background1" w:themeShade="80"/>
+        <w:lang w:val="es-ES"/>
+      </w:rPr>
+      <w:t>Estructura y Organización de Datos– TP1</w:t>
+    </w:r>
+  </w:p>
+  <w:p>
+    <w:pPr>
+      <w:pStyle w:val="Encabezado"/>
+      <w:tabs>
+        <w:tab w:val="left" w:pos="6210"/>
+      </w:tabs>
+      <w:rPr>
+        <w:rFonts w:ascii="Cambria Math" w:hAnsi="Cambria Math" w:cs="Arial"/>
+        <w:color w:val="808080" w:themeColor="background1" w:themeShade="80"/>
+        <w:lang w:val="it-IT"/>
+      </w:rPr>
+    </w:pPr>
+    <w:r>
+      <w:rPr>
+        <w:rFonts w:ascii="Cambria Math" w:hAnsi="Cambria Math" w:cs="Arial"/>
+        <w:color w:val="808080" w:themeColor="background1" w:themeShade="80"/>
+        <w:lang w:val="it-IT"/>
+      </w:rPr>
+      <w:t>Alumnos: Bellone, Martín; Garcia Di Martino, Laureano; Sorrenti, Enzo</w:t>
+    </w:r>
+  </w:p>
+  <w:p>
+    <w:pPr>
+      <w:pStyle w:val="Encabezado"/>
+    </w:pPr>
+  </w:p>
+</w:hdr>
+</file>
+
+<file path=word/header2.xml><?xml version="1.0" encoding="utf-8"?>
+<w:hdr xmlns:wpc="http://schemas.microsoft.com/office/word/2010/wordprocessingCanvas" xmlns:cx="http://schemas.microsoft.com/office/drawing/2014/chartex" xmlns:cx1="http://schemas.microsoft.com/office/drawing/2015/9/8/chartex" xmlns:cx2="http://schemas.microsoft.com/office/drawing/2015/10/21/chartex" xmlns:cx3="http://schemas.microsoft.com/office/drawing/2016/5/9/chartex" xmlns:cx4="http://schemas.microsoft.com/office/drawing/2016/5/10/chartex" xmlns:cx5="http://schemas.microsoft.com/office/drawing/2016/5/11/chartex" xmlns:cx6="http://schemas.microsoft.com/office/drawing/2016/5/12/chartex" xmlns:cx7="http://schemas.microsoft.com/office/drawing/2016/5/13/chartex" xmlns:cx8="http://schemas.microsoft.com/office/drawing/2016/5/14/chartex" xmlns:mc="http://schemas.openxmlformats.org/markup-compatibility/2006" xmlns:aink="http://schemas.microsoft.com/office/drawing/2016/ink" xmlns:am3d="http://schemas.microsoft.com/office/drawing/2017/model3d" xmlns:o="urn:schemas-microsoft-com:office:office" xmlns:oel="http://schemas.microsoft.com/office/2019/extlst" xmlns:r="http://schemas.openxmlformats.org/officeDocument/2006/relationships" xmlns:m="http://schemas.openxmlformats.org/officeDocument/2006/math" xmlns:v="urn:schemas-microsoft-com:vml" xmlns:wp14="http://schemas.microsoft.com/office/word/2010/wordprocessingDrawing" xmlns:wp="http://schemas.openxmlformats.org/drawingml/2006/wordprocessingDrawing" xmlns:w10="urn:schemas-microsoft-com:office:word" xmlns:w="http://schemas.openxmlformats.org/wordprocessingml/2006/main" xmlns:w14="http://schemas.microsoft.com/office/word/2010/wordml" xmlns:w15="http://schemas.microsoft.com/office/word/2012/wordml" xmlns:w16cex="http://schemas.microsoft.com/office/word/2018/wordml/cex" xmlns:w16cid="http://schemas.microsoft.com/office/word/2016/wordml/cid" xmlns:w16="http://schemas.microsoft.com/office/word/2018/wordml" xmlns:w16du="http://schemas.microsoft.com/office/word/2023/wordml/word16du" xmlns:w16sdtdh="http://schemas.microsoft.com/office/word/2020/wordml/sdtdatahash" xmlns:w16sdtfl="http://schemas.microsoft.com/office/word/2024/wordml/sdtformatlock" xmlns:w16se="http://schemas.microsoft.com/office/word/2015/wordml/symex" xmlns:wpg="http://schemas.microsoft.com/office/word/2010/wordprocessingGroup" xmlns:wpi="http://schemas.microsoft.com/office/word/2010/wordprocessingInk" xmlns:wne="http://schemas.microsoft.com/office/word/2006/wordml" xmlns:wps="http://schemas.microsoft.com/office/word/2010/wordprocessingShape" mc:Ignorable="w14 w15 w16se w16cid w16 w16cex w16sdtdh w16sdtfl w16du wp14">
+  <w:p>
+    <w:pPr>
+      <w:pStyle w:val="Encabezado"/>
+      <w:rPr>
+        <w:rFonts w:ascii="Cambria Math" w:hAnsi="Cambria Math" w:cs="Arial"/>
+        <w:color w:val="808080" w:themeColor="background1" w:themeShade="80"/>
+        <w:lang w:val="es-ES"/>
+      </w:rPr>
+    </w:pPr>
+    <w:r>
+      <w:rPr>
+        <w:rFonts w:ascii="Cambria Math" w:hAnsi="Cambria Math"/>
+        <w:noProof/>
+        <w:color w:val="808080" w:themeColor="background1" w:themeShade="80"/>
+        <w:lang w:val="en-US"/>
+      </w:rPr>
+      <w:drawing>
+        <wp:anchor distT="0" distB="0" distL="114300" distR="114300" simplePos="0" relativeHeight="251659264" behindDoc="0" locked="0" layoutInCell="1" allowOverlap="1" wp14:anchorId="2812A8B3" wp14:editId="6EDE9744">
+          <wp:simplePos x="0" y="0"/>
+          <wp:positionH relativeFrom="column">
+            <wp:posOffset>4865066</wp:posOffset>
+          </wp:positionH>
+          <wp:positionV relativeFrom="paragraph">
+            <wp:posOffset>-52070</wp:posOffset>
+          </wp:positionV>
+          <wp:extent cx="819150" cy="564515"/>
+          <wp:effectExtent l="0" t="0" r="0" b="6985"/>
+          <wp:wrapSquare wrapText="bothSides"/>
+          <wp:docPr id="11" name="Imagen 18"/>
+          <wp:cNvGraphicFramePr>
+            <a:graphicFrameLocks xmlns:a="http://schemas.openxmlformats.org/drawingml/2006/main" noChangeAspect="1"/>
+          </wp:cNvGraphicFramePr>
+          <a:graphic xmlns:a="http://schemas.openxmlformats.org/drawingml/2006/main">
+            <a:graphicData uri="http://schemas.openxmlformats.org/drawingml/2006/picture">
+              <pic:pic xmlns:pic="http://schemas.openxmlformats.org/drawingml/2006/picture">
+                <pic:nvPicPr>
+                  <pic:cNvPr id="0" name="Imagen 58"/>
+                  <pic:cNvPicPr>
+                    <a:picLocks noChangeAspect="1" noChangeArrowheads="1"/>
+                  </pic:cNvPicPr>
+                </pic:nvPicPr>
+                <pic:blipFill>
+                  <a:blip r:embed="rId1">
+                    <a:extLst>
+                      <a:ext uri="{28A0092B-C50C-407E-A947-70E740481C1C}">
+                        <a14:useLocalDpi xmlns:a14="http://schemas.microsoft.com/office/drawing/2010/main" val="0"/>
+                      </a:ext>
+                    </a:extLst>
+                  </a:blip>
+                  <a:srcRect/>
+                  <a:stretch>
+                    <a:fillRect/>
+                  </a:stretch>
+                </pic:blipFill>
+                <pic:spPr bwMode="auto">
+                  <a:xfrm>
+                    <a:off x="0" y="0"/>
+                    <a:ext cx="819150" cy="564515"/>
+                  </a:xfrm>
+                  <a:prstGeom prst="rect">
+                    <a:avLst/>
+                  </a:prstGeom>
+                  <a:noFill/>
+                </pic:spPr>
+              </pic:pic>
+            </a:graphicData>
+          </a:graphic>
+          <wp14:sizeRelH relativeFrom="page">
+            <wp14:pctWidth>0</wp14:pctWidth>
+          </wp14:sizeRelH>
+          <wp14:sizeRelV relativeFrom="page">
+            <wp14:pctHeight>0</wp14:pctHeight>
+          </wp14:sizeRelV>
+        </wp:anchor>
+      </w:drawing>
+    </w:r>
+    <w:r>
+      <w:rPr>
+        <w:rFonts w:ascii="Cambria Math" w:hAnsi="Cambria Math" w:cs="Arial"/>
+        <w:color w:val="808080" w:themeColor="background1" w:themeShade="80"/>
+        <w:lang w:val="es-ES"/>
+      </w:rPr>
+      <w:t>Universidad Nacional de Mar del Plata – Facultad de Ingeniería</w:t>
+    </w:r>
+  </w:p>
+  <w:p>
+    <w:pPr>
+      <w:pStyle w:val="Encabezado"/>
+      <w:tabs>
+        <w:tab w:val="left" w:pos="6210"/>
+      </w:tabs>
+      <w:rPr>
+        <w:rFonts w:ascii="Cambria Math" w:hAnsi="Cambria Math" w:cs="Arial"/>
+        <w:color w:val="808080" w:themeColor="background1" w:themeShade="80"/>
+        <w:lang w:val="es-ES"/>
+      </w:rPr>
+    </w:pPr>
+    <w:r>
+      <w:rPr>
+        <w:rFonts w:ascii="Cambria Math" w:hAnsi="Cambria Math" w:cs="Arial"/>
+        <w:color w:val="808080" w:themeColor="background1" w:themeShade="80"/>
+        <w:lang w:val="es-ES"/>
+      </w:rPr>
+      <w:t>Materia</w:t>
+    </w:r>
+    <w:r>
+      <w:rPr>
+        <w:rFonts w:ascii="Cambria Math" w:hAnsi="Cambria Math" w:cs="Arial"/>
+        <w:color w:val="808080" w:themeColor="background1" w:themeShade="80"/>
+        <w:lang w:val="es-ES"/>
+      </w:rPr>
+      <w:t xml:space="preserve"> – </w:t>
+    </w:r>
+    <w:r>
+      <w:rPr>
+        <w:rFonts w:ascii="Cambria Math" w:hAnsi="Cambria Math" w:cs="Arial"/>
+        <w:color w:val="808080" w:themeColor="background1" w:themeShade="80"/>
+        <w:lang w:val="es-ES"/>
+      </w:rPr>
+      <w:t>Nombre del trabajo</w:t>
+    </w:r>
+  </w:p>
+  <w:p>
+    <w:pPr>
+      <w:pStyle w:val="Encabezado"/>
+      <w:tabs>
+        <w:tab w:val="left" w:pos="6210"/>
+      </w:tabs>
+      <w:rPr>
+        <w:rFonts w:ascii="Cambria Math" w:hAnsi="Cambria Math" w:cs="Arial"/>
+        <w:color w:val="808080" w:themeColor="background1" w:themeShade="80"/>
+        <w:lang w:val="it-IT"/>
+      </w:rPr>
+    </w:pPr>
+    <w:r>
+      <w:rPr>
+        <w:rFonts w:ascii="Cambria Math" w:hAnsi="Cambria Math" w:cs="Arial"/>
+        <w:color w:val="808080" w:themeColor="background1" w:themeShade="80"/>
+        <w:lang w:val="it-IT"/>
+      </w:rPr>
+      <w:t>Alumnos</w:t>
+    </w:r>
+    <w:r>
+      <w:rPr>
+        <w:rFonts w:ascii="Cambria Math" w:hAnsi="Cambria Math" w:cs="Arial"/>
+        <w:color w:val="808080" w:themeColor="background1" w:themeShade="80"/>
+        <w:lang w:val="it-IT"/>
+      </w:rPr>
+      <w:t xml:space="preserve">: </w:t>
+    </w:r>
+    <w:r>
+      <w:rPr>
+        <w:rFonts w:ascii="Cambria Math" w:hAnsi="Cambria Math" w:cs="Arial"/>
+        <w:color w:val="808080" w:themeColor="background1" w:themeShade="80"/>
+        <w:lang w:val="it-IT"/>
+      </w:rPr>
+      <w:t>Apellido, Nombre</w:t>
+    </w:r>
+  </w:p>
+  <w:p>
+    <w:pPr>
+      <w:pStyle w:val="Encabezado"/>
+      <w:rPr>
+        <w:rFonts w:ascii="Cambria Math" w:hAnsi="Cambria Math"/>
+      </w:rPr>
+    </w:pPr>
+  </w:p>
+  <w:p>
+    <w:pPr>
+      <w:pStyle w:val="Encabezado"/>
+    </w:pPr>
+  </w:p>
+</w:hdr>
 </file>
 
 <file path=word/numbering.xml><?xml version="1.0" encoding="utf-8"?>
@@ -4811,6 +5014,7 @@
   <w:style w:type="character" w:default="1" w:styleId="Fuentedeprrafopredeter">
     <w:name w:val="Default Paragraph Font"/>
     <w:uiPriority w:val="1"/>
+    <w:semiHidden/>
     <w:unhideWhenUsed/>
   </w:style>
   <w:style w:type="table" w:default="1" w:styleId="Tablanormal">
@@ -5187,6 +5391,56 @@
       <w:color w:val="666666"/>
     </w:rPr>
   </w:style>
+  <w:style w:type="paragraph" w:styleId="Encabezado">
+    <w:name w:val="header"/>
+    <w:basedOn w:val="Normal"/>
+    <w:link w:val="EncabezadoCar"/>
+    <w:uiPriority w:val="99"/>
+    <w:unhideWhenUsed/>
+    <w:rsid w:val="00C91A53"/>
+    <w:pPr>
+      <w:tabs>
+        <w:tab w:val="center" w:pos="4419"/>
+        <w:tab w:val="right" w:pos="8838"/>
+      </w:tabs>
+      <w:spacing w:after="0" w:line="240" w:lineRule="auto"/>
+    </w:pPr>
+  </w:style>
+  <w:style w:type="character" w:customStyle="1" w:styleId="EncabezadoCar">
+    <w:name w:val="Encabezado Car"/>
+    <w:basedOn w:val="Fuentedeprrafopredeter"/>
+    <w:link w:val="Encabezado"/>
+    <w:uiPriority w:val="99"/>
+    <w:rsid w:val="00C91A53"/>
+    <w:rPr>
+      <w:lang w:val="es-AR"/>
+    </w:rPr>
+  </w:style>
+  <w:style w:type="paragraph" w:styleId="Piedepgina">
+    <w:name w:val="footer"/>
+    <w:basedOn w:val="Normal"/>
+    <w:link w:val="PiedepginaCar"/>
+    <w:uiPriority w:val="99"/>
+    <w:unhideWhenUsed/>
+    <w:rsid w:val="00C91A53"/>
+    <w:pPr>
+      <w:tabs>
+        <w:tab w:val="center" w:pos="4419"/>
+        <w:tab w:val="right" w:pos="8838"/>
+      </w:tabs>
+      <w:spacing w:after="0" w:line="240" w:lineRule="auto"/>
+    </w:pPr>
+  </w:style>
+  <w:style w:type="character" w:customStyle="1" w:styleId="PiedepginaCar">
+    <w:name w:val="Pie de página Car"/>
+    <w:basedOn w:val="Fuentedeprrafopredeter"/>
+    <w:link w:val="Piedepgina"/>
+    <w:uiPriority w:val="99"/>
+    <w:rsid w:val="00C91A53"/>
+    <w:rPr>
+      <w:lang w:val="es-AR"/>
+    </w:rPr>
+  </w:style>
 </w:styles>
 </file>
 

</xml_diff>